<commit_message>
feat(botany): fix 10 unit excel preview, support multi-file batch upload, and make UI fully responsive
</commit_message>
<xml_diff>
--- a/docs/BOTANY ASSISTANT PROFESSORDaybyday calendar.docx
+++ b/docs/BOTANY ASSISTANT PROFESSORDaybyday calendar.docx
@@ -3149,6 +3149,216 @@
           <w:tcPr>
             <w:tcW w:w="0" w:type="auto"/>
             <w:hideMark/>
+          </w:tcPr>
+          <w:p>
+            <w:pPr>
+              <w:spacing w:line="360" w:lineRule="auto"/>
+              <w:rPr>
+                <w:rFonts w:ascii="Times New Roman" w:eastAsia="Times New Roman" w:hAnsi="Times New Roman" w:cs="Times New Roman"/>
+                <w:sz w:val="24"/>
+                <w:szCs w:val="24"/>
+                <w:lang w:eastAsia="en-IN"/>
+              </w:rPr>
+            </w:pPr>
+            <w:r>
+              <w:rPr>
+                <w:rFonts w:ascii="Times New Roman" w:eastAsia="Times New Roman" w:hAnsi="Times New Roman" w:cs="Times New Roman"/>
+                <w:sz w:val="24"/>
+                <w:szCs w:val="24"/>
+                <w:lang w:eastAsia="en-IN"/>
+              </w:rPr>
+              <w:t>120 Q, 18</w:t>
+            </w:r>
+            <w:r>
+              <w:rPr>
+                <w:rFonts w:ascii="Times New Roman" w:eastAsia="Times New Roman" w:hAnsi="Times New Roman" w:cs="Times New Roman"/>
+                <w:sz w:val="24"/>
+                <w:szCs w:val="24"/>
+                <w:lang w:eastAsia="en-IN"/>
+              </w:rPr>
+              <w:t>0 min</w:t>
+            </w:r>
+          </w:p>
+        </w:tc>
+      </w:tr>
+      <w:tr>
+        <w:tc>
+          <w:tcPr>
+            <w:tcW w:w="1526" w:type="dxa"/>
+          </w:tcPr>
+          <w:p>
+            <w:pPr>
+              <w:spacing w:line="360" w:lineRule="auto"/>
+              <w:rPr>
+                <w:rFonts w:ascii="Times New Roman" w:eastAsia="Times New Roman" w:hAnsi="Times New Roman" w:cs="Times New Roman"/>
+                <w:b/>
+                <w:bCs/>
+                <w:sz w:val="24"/>
+                <w:szCs w:val="24"/>
+                <w:lang w:eastAsia="en-IN"/>
+              </w:rPr>
+            </w:pPr>
+          </w:p>
+        </w:tc>
+        <w:tc>
+          <w:tcPr>
+            <w:tcW w:w="5529" w:type="dxa"/>
+          </w:tcPr>
+          <w:p>
+            <w:pPr>
+              <w:spacing w:line="360" w:lineRule="auto"/>
+              <w:rPr>
+                <w:rFonts w:ascii="Times New Roman" w:eastAsia="Times New Roman" w:hAnsi="Times New Roman" w:cs="Times New Roman"/>
+                <w:b/>
+                <w:bCs/>
+                <w:sz w:val="24"/>
+                <w:szCs w:val="24"/>
+                <w:lang w:eastAsia="en-IN"/>
+              </w:rPr>
+            </w:pPr>
+            <w:r>
+              <w:rPr>
+                <w:rFonts w:ascii="Times New Roman" w:eastAsia="Times New Roman" w:hAnsi="Times New Roman" w:cs="Times New Roman"/>
+                <w:b/>
+                <w:bCs/>
+                <w:sz w:val="24"/>
+                <w:szCs w:val="24"/>
+                <w:lang w:eastAsia="en-IN"/>
+              </w:rPr>
+              <w:t xml:space="preserve">Mock </w:t>
+            </w:r>
+            <w:r>
+              <w:rPr>
+                <w:rFonts w:ascii="Times New Roman" w:eastAsia="Times New Roman" w:hAnsi="Times New Roman" w:cs="Times New Roman"/>
+                <w:b/>
+                <w:bCs/>
+                <w:sz w:val="24"/>
+                <w:szCs w:val="24"/>
+                <w:lang w:eastAsia="en-IN"/>
+              </w:rPr>
+              <w:t>10</w:t>
+            </w:r>
+            <w:r>
+              <w:rPr>
+                <w:rFonts w:ascii="Times New Roman" w:eastAsia="Times New Roman" w:hAnsi="Times New Roman" w:cs="Times New Roman"/>
+                <w:b/>
+                <w:bCs/>
+                <w:sz w:val="24"/>
+                <w:szCs w:val="24"/>
+                <w:lang w:eastAsia="en-IN"/>
+              </w:rPr>
+              <w:t xml:space="preserve"> (grand finale)</w:t>
+            </w:r>
+          </w:p>
+        </w:tc>
+        <w:tc>
+          <w:tcPr>
+            <w:tcW w:w="0" w:type="auto"/>
+          </w:tcPr>
+          <w:p>
+            <w:pPr>
+              <w:spacing w:line="360" w:lineRule="auto"/>
+              <w:rPr>
+                <w:rFonts w:ascii="Times New Roman" w:eastAsia="Times New Roman" w:hAnsi="Times New Roman" w:cs="Times New Roman"/>
+                <w:sz w:val="24"/>
+                <w:szCs w:val="24"/>
+                <w:lang w:eastAsia="en-IN"/>
+              </w:rPr>
+            </w:pPr>
+            <w:r>
+              <w:rPr>
+                <w:rFonts w:ascii="Times New Roman" w:eastAsia="Times New Roman" w:hAnsi="Times New Roman" w:cs="Times New Roman"/>
+                <w:sz w:val="24"/>
+                <w:szCs w:val="24"/>
+                <w:lang w:eastAsia="en-IN"/>
+              </w:rPr>
+              <w:t>120 Q, 18</w:t>
+            </w:r>
+            <w:r>
+              <w:rPr>
+                <w:rFonts w:ascii="Times New Roman" w:eastAsia="Times New Roman" w:hAnsi="Times New Roman" w:cs="Times New Roman"/>
+                <w:sz w:val="24"/>
+                <w:szCs w:val="24"/>
+                <w:lang w:eastAsia="en-IN"/>
+              </w:rPr>
+              <w:t>0 min</w:t>
+            </w:r>
+          </w:p>
+        </w:tc>
+      </w:tr>
+      <w:tr>
+        <w:tc>
+          <w:tcPr>
+            <w:tcW w:w="1526" w:type="dxa"/>
+          </w:tcPr>
+          <w:p>
+            <w:pPr>
+              <w:spacing w:line="360" w:lineRule="auto"/>
+              <w:rPr>
+                <w:rFonts w:ascii="Times New Roman" w:eastAsia="Times New Roman" w:hAnsi="Times New Roman" w:cs="Times New Roman"/>
+                <w:b/>
+                <w:bCs/>
+                <w:sz w:val="24"/>
+                <w:szCs w:val="24"/>
+                <w:lang w:eastAsia="en-IN"/>
+              </w:rPr>
+            </w:pPr>
+          </w:p>
+        </w:tc>
+        <w:tc>
+          <w:tcPr>
+            <w:tcW w:w="5529" w:type="dxa"/>
+          </w:tcPr>
+          <w:p>
+            <w:pPr>
+              <w:spacing w:line="360" w:lineRule="auto"/>
+              <w:rPr>
+                <w:rFonts w:ascii="Times New Roman" w:eastAsia="Times New Roman" w:hAnsi="Times New Roman" w:cs="Times New Roman"/>
+                <w:b/>
+                <w:bCs/>
+                <w:sz w:val="24"/>
+                <w:szCs w:val="24"/>
+                <w:lang w:eastAsia="en-IN"/>
+              </w:rPr>
+            </w:pPr>
+            <w:r>
+              <w:rPr>
+                <w:rFonts w:ascii="Times New Roman" w:eastAsia="Times New Roman" w:hAnsi="Times New Roman" w:cs="Times New Roman"/>
+                <w:b/>
+                <w:bCs/>
+                <w:sz w:val="24"/>
+                <w:szCs w:val="24"/>
+                <w:lang w:eastAsia="en-IN"/>
+              </w:rPr>
+              <w:t xml:space="preserve">Mock </w:t>
+            </w:r>
+            <w:r>
+              <w:rPr>
+                <w:rFonts w:ascii="Times New Roman" w:eastAsia="Times New Roman" w:hAnsi="Times New Roman" w:cs="Times New Roman"/>
+                <w:b/>
+                <w:bCs/>
+                <w:sz w:val="24"/>
+                <w:szCs w:val="24"/>
+                <w:lang w:eastAsia="en-IN"/>
+              </w:rPr>
+              <w:t>11</w:t>
+            </w:r>
+            <w:r>
+              <w:rPr>
+                <w:rFonts w:ascii="Times New Roman" w:eastAsia="Times New Roman" w:hAnsi="Times New Roman" w:cs="Times New Roman"/>
+                <w:b/>
+                <w:bCs/>
+                <w:sz w:val="24"/>
+                <w:szCs w:val="24"/>
+                <w:lang w:eastAsia="en-IN"/>
+              </w:rPr>
+              <w:t xml:space="preserve"> (grand finale)</w:t>
+            </w:r>
+          </w:p>
+        </w:tc>
+        <w:tc>
+          <w:tcPr>
+            <w:tcW w:w="0" w:type="auto"/>
           </w:tcPr>
           <w:p>
             <w:pPr>

</xml_diff>